<commit_message>
Accept the template's tracked changes and fit both card images in the PDF
Running the flow end to end showed two things only LibreOffice's PDF
revealed: the anonymised PLT-01 still carried seven tracked changes, which
Word hid when exporting but LibreOffice prints as revision bars, and the two
70 mm identity-card images stacked and pushed out a blank fourth page. The
converter now accepts tracked changes (and fails on any it cannot), the
committed v1 template is rebuilt with it, and the cards print at 60 mm. The
PDF is now three pages, like Word's.

refs #50

Co-Authored-By: Claude Opus 5.5 <noreply@anthropic.com>
</commit_message>
<xml_diff>
--- a/crm_easyoffice/documentos/plantillas_semilla/PLT-01_v1.docx
+++ b/crm_easyoffice/documentos/plantillas_semilla/PLT-01_v1.docx
@@ -250,19 +250,6 @@
         </w:rPr>
         <w:t xml:space="preserve">, representada por don {{ eo.representante }}, {{ eo.nacionalidad }}, {{ eo.estado_civil }}, {{ eo.profesion }}, cédula de identidad número {{ eo.rut }}</w:t>
       </w:r>
-      <w:del w:id="4" w:author="Usuario" w:date="2025-04-01T11:27:00Z">
-        <w:r>
-          <w:rPr>
-            <w:rFonts w:ascii="Times New Roman" w:eastAsia="Times New Roman" w:hAnsi="Times New Roman" w:cs="Times New Roman"/>
-            <w:kern w:val="0"/>
-            <w:sz w:val="17"/>
-            <w:szCs w:val="17"/>
-            <w:lang w:val="es-ES_tradnl" w:eastAsia="es-ES_tradnl"/>
-            <w14:ligatures w14:val="none"/>
-          </w:rPr>
-          <w:delText xml:space="preserve"> </w:delText>
-        </w:r>
-      </w:del>
       <w:r>
         <w:rPr>
           <w:rFonts w:ascii="Times New Roman" w:eastAsia="Times New Roman" w:hAnsi="Times New Roman" w:cs="Times New Roman"/>
@@ -342,20 +329,18 @@
         </w:rPr>
         <w:t xml:space="preserve"/>
       </w:r>
-      <w:ins w:id="5" w:author="Usuario" w:date="2025-04-01T11:35:00Z">
-        <w:r>
-          <w:rPr>
-            <w:rFonts w:ascii="Times New Roman" w:eastAsia="Times New Roman" w:hAnsi="Times New Roman" w:cs="Times New Roman"/>
-            <w:b/>
-            <w:kern w:val="0"/>
-            <w:sz w:val="17"/>
-            <w:szCs w:val="17"/>
-            <w:lang w:val="es-ES_tradnl" w:eastAsia="es-ES_tradnl"/>
-            <w14:ligatures w14:val="none"/>
-          </w:rPr>
-          <w:t xml:space="preserve"/>
-        </w:r>
-      </w:ins>
+      <w:r>
+        <w:rPr>
+          <w:rFonts w:ascii="Times New Roman" w:eastAsia="Times New Roman" w:hAnsi="Times New Roman" w:cs="Times New Roman"/>
+          <w:b/>
+          <w:kern w:val="0"/>
+          <w:sz w:val="17"/>
+          <w:szCs w:val="17"/>
+          <w:lang w:val="es-ES_tradnl" w:eastAsia="es-ES_tradnl"/>
+          <w14:ligatures w14:val="none"/>
+        </w:rPr>
+        <w:t xml:space="preserve"/>
+      </w:r>
       <w:r>
         <w:rPr>
           <w:rFonts w:ascii="Times New Roman" w:eastAsia="Times New Roman" w:hAnsi="Times New Roman" w:cs="Times New Roman"/>
@@ -3690,19 +3675,17 @@
         </w:rPr>
         <w:t>. Al término de dicho plazo</w:t>
       </w:r>
-      <w:ins w:id="7" w:author="Usuario" w:date="2025-04-01T11:32:00Z">
-        <w:r>
-          <w:rPr>
-            <w:rFonts w:ascii="Times New Roman" w:eastAsia="Times New Roman" w:hAnsi="Times New Roman" w:cs="Times New Roman"/>
-            <w:kern w:val="0"/>
-            <w:sz w:val="16"/>
-            <w:szCs w:val="16"/>
-            <w:lang w:val="es-ES_tradnl" w:eastAsia="es-ES_tradnl"/>
-            <w14:ligatures w14:val="none"/>
-          </w:rPr>
-          <w:t>,</w:t>
-        </w:r>
-      </w:ins>
+      <w:r>
+        <w:rPr>
+          <w:rFonts w:ascii="Times New Roman" w:eastAsia="Times New Roman" w:hAnsi="Times New Roman" w:cs="Times New Roman"/>
+          <w:kern w:val="0"/>
+          <w:sz w:val="16"/>
+          <w:szCs w:val="16"/>
+          <w:lang w:val="es-ES_tradnl" w:eastAsia="es-ES_tradnl"/>
+          <w14:ligatures w14:val="none"/>
+        </w:rPr>
+        <w:t>,</w:t>
+      </w:r>
       <w:r>
         <w:rPr>
           <w:rFonts w:ascii="Times New Roman" w:eastAsia="Times New Roman" w:hAnsi="Times New Roman" w:cs="Times New Roman"/>
@@ -3846,19 +3829,6 @@
         </w:rPr>
         <w:t>al domicilio individualizado de cada parte</w:t>
       </w:r>
-      <w:del w:id="8" w:author="Usuario" w:date="2025-04-01T11:41:00Z">
-        <w:r>
-          <w:rPr>
-            <w:rFonts w:ascii="Times New Roman" w:eastAsia="Times New Roman" w:hAnsi="Times New Roman" w:cs="Times New Roman"/>
-            <w:kern w:val="0"/>
-            <w:sz w:val="16"/>
-            <w:szCs w:val="16"/>
-            <w:lang w:val="es-ES_tradnl" w:eastAsia="es-ES_tradnl"/>
-            <w14:ligatures w14:val="none"/>
-          </w:rPr>
-          <w:delText>,</w:delText>
-        </w:r>
-      </w:del>
       <w:r>
         <w:rPr>
           <w:rFonts w:ascii="Times New Roman" w:eastAsia="Times New Roman" w:hAnsi="Times New Roman" w:cs="Times New Roman"/>
@@ -3994,19 +3964,6 @@
         </w:rPr>
         <w:t>EASY OFFICE</w:t>
       </w:r>
-      <w:del w:id="9" w:author="Usuario" w:date="2025-04-01T11:41:00Z">
-        <w:r>
-          <w:rPr>
-            <w:rFonts w:ascii="Times New Roman" w:eastAsia="Times New Roman" w:hAnsi="Times New Roman" w:cs="Times New Roman"/>
-            <w:kern w:val="0"/>
-            <w:sz w:val="16"/>
-            <w:szCs w:val="16"/>
-            <w:lang w:val="es-ES_tradnl" w:eastAsia="es-ES_tradnl"/>
-            <w14:ligatures w14:val="none"/>
-          </w:rPr>
-          <w:delText>,</w:delText>
-        </w:r>
-      </w:del>
       <w:r>
         <w:rPr>
           <w:rFonts w:ascii="Times New Roman" w:eastAsia="Times New Roman" w:hAnsi="Times New Roman" w:cs="Times New Roman"/>
@@ -4250,19 +4207,6 @@
         </w:rPr>
         <w:t>N</w:t>
       </w:r>
-      <w:del w:id="10" w:author="Usuario" w:date="2025-04-01T11:33:00Z">
-        <w:r>
-          <w:rPr>
-            <w:rFonts w:ascii="Times New Roman" w:eastAsia="Times New Roman" w:hAnsi="Times New Roman" w:cs="Times New Roman"/>
-            <w:kern w:val="0"/>
-            <w:sz w:val="16"/>
-            <w:szCs w:val="16"/>
-            <w:lang w:val="es-ES_tradnl" w:eastAsia="es-ES_tradnl"/>
-            <w14:ligatures w14:val="none"/>
-          </w:rPr>
-          <w:delText>.</w:delText>
-        </w:r>
-      </w:del>
       <w:r>
         <w:rPr>
           <w:rFonts w:ascii="Times New Roman" w:eastAsia="Times New Roman" w:hAnsi="Times New Roman" w:cs="Times New Roman"/>
@@ -4274,19 +4218,6 @@
         </w:rPr>
         <w:t>º</w:t>
       </w:r>
-      <w:del w:id="11" w:author="Usuario" w:date="2025-04-01T11:33:00Z">
-        <w:r>
-          <w:rPr>
-            <w:rFonts w:ascii="Times New Roman" w:eastAsia="Times New Roman" w:hAnsi="Times New Roman" w:cs="Times New Roman"/>
-            <w:kern w:val="0"/>
-            <w:sz w:val="16"/>
-            <w:szCs w:val="16"/>
-            <w:lang w:val="es-ES_tradnl" w:eastAsia="es-ES_tradnl"/>
-            <w14:ligatures w14:val="none"/>
-          </w:rPr>
-          <w:delText xml:space="preserve"> </w:delText>
-        </w:r>
-      </w:del>
       <w:r>
         <w:rPr>
           <w:rFonts w:ascii="Times New Roman" w:eastAsia="Times New Roman" w:hAnsi="Times New Roman" w:cs="Times New Roman"/>

</xml_diff>